<commit_message>
Update UGD report template
</commit_message>
<xml_diff>
--- a/sablon/UGDR_Sablon.docx
+++ b/sablon/UGDR_Sablon.docx
@@ -2818,7 +2818,20 @@
         <w:rPr>
           <w:rStyle w:val="CharacterStyle12"/>
         </w:rPr>
-        <w:t>---</w:t>
+        <w:t>{stabilitenot}</w:t>
+      </w:r>
+      <w:r>
+        <w:rPr>
+          <w:rStyle w:val="CharacterStyle12"/>
+        </w:rPr>
+        <w:br/>
+      </w:r>
+      <w:r>
+        <w:rPr>
+          <w:rStyle w:val="CharacterStyle12"/>
+        </w:rPr>
+        <w:br/>
+        <w:t>{stabilitefoto}</w:t>
       </w:r>
     </w:p>
     <w:p>
@@ -2920,13 +2933,34 @@
         <w:ind w:left="-142"/>
         <w:rPr>
           <w:rStyle w:val="CharacterStyle12"/>
+          <w:b/>
+          <w:bCs/>
         </w:rPr>
       </w:pPr>
       <w:r>
         <w:rPr>
           <w:rStyle w:val="CharacterStyle13"/>
-        </w:rPr>
-        <w:t>--</w:t>
+          <w:b w:val="0"/>
+          <w:bCs/>
+        </w:rPr>
+        <w:t>{challengenot}</w:t>
+      </w:r>
+      <w:r>
+        <w:rPr>
+          <w:rStyle w:val="CharacterStyle13"/>
+          <w:b w:val="0"/>
+          <w:bCs/>
+        </w:rPr>
+        <w:t xml:space="preserve"> </w:t>
+      </w:r>
+      <w:r>
+        <w:rPr>
+          <w:rStyle w:val="CharacterStyle13"/>
+          <w:b w:val="0"/>
+          <w:bCs/>
+        </w:rPr>
+        <w:br/>
+        <w:t>{challengefoto}</w:t>
       </w:r>
     </w:p>
     <w:p>
@@ -3634,16 +3668,18 @@
       <w:r>
         <w:rPr>
           <w:rStyle w:val="CharacterStyle12"/>
-          <w:highlight w:val="yellow"/>
-        </w:rPr>
-        <w:t>----</w:t>
-      </w:r>
-      <w:r>
-        <w:rPr>
-          <w:rStyle w:val="CharacterStyle12"/>
-          <w:highlight w:val="yellow"/>
-        </w:rPr>
-        <w:t>Testlerin açıklama ve görselleri</w:t>
+        </w:rPr>
+        <w:t xml:space="preserve">{mikroaciklama} </w:t>
+      </w:r>
+      <w:r>
+        <w:rPr>
+          <w:rFonts w:ascii="Microsoft Sans Serif" w:eastAsia="Microsoft Sans Serif" w:hAnsi="Microsoft Sans Serif"/>
+          <w:noProof/>
+          <w:color w:val="000000"/>
+          <w:sz w:val="19"/>
+          <w:szCs w:val="19"/>
+        </w:rPr>
+        <w:t>{mikrofoto}</w:t>
       </w:r>
     </w:p>
     <w:p>
@@ -3940,6 +3976,12 @@
                 <w:rStyle w:val="CharacterStyle11"/>
               </w:rPr>
             </w:pPr>
+            <w:r>
+              <w:rPr>
+                <w:rStyle w:val="CharacterStyle11"/>
+              </w:rPr>
+              <w:t>{kullanım}</w:t>
+            </w:r>
           </w:p>
         </w:tc>
       </w:tr>
@@ -3995,6 +4037,12 @@
                 <w:rStyle w:val="CharacterStyle11"/>
               </w:rPr>
             </w:pPr>
+            <w:r>
+              <w:rPr>
+                <w:rStyle w:val="CharacterStyle11"/>
+              </w:rPr>
+              <w:t>{uyarilar}</w:t>
+            </w:r>
           </w:p>
         </w:tc>
       </w:tr>
@@ -4002,10 +4050,17 @@
     <w:p/>
     <w:p>
       <w:r>
-        <w:rPr>
-          <w:highlight w:val="yellow"/>
-        </w:rPr>
-        <w:t>Kutu etiket görseli</w:t>
+        <w:t>{</w:t>
+      </w:r>
+      <w:proofErr w:type="spellStart"/>
+      <w:proofErr w:type="gramStart"/>
+      <w:r>
+        <w:t>kutufoto</w:t>
+      </w:r>
+      <w:proofErr w:type="spellEnd"/>
+      <w:proofErr w:type="gramEnd"/>
+      <w:r>
+        <w:t>}</w:t>
       </w:r>
     </w:p>
     <w:p/>
@@ -4136,7 +4191,7 @@
               <w:rPr>
                 <w:rStyle w:val="CharacterStyle11"/>
               </w:rPr>
-              <w:t>Durulanmayan</w:t>
+              <w:t>{uruntipi}</w:t>
             </w:r>
           </w:p>
         </w:tc>
@@ -4197,7 +4252,7 @@
               <w:rPr>
                 <w:rStyle w:val="CharacterStyle11"/>
               </w:rPr>
-              <w:t>Tüm vücut</w:t>
+              <w:t>{uygulamayeri}</w:t>
             </w:r>
           </w:p>
         </w:tc>
@@ -4258,7 +4313,7 @@
               <w:rPr>
                 <w:rStyle w:val="CharacterStyle11"/>
               </w:rPr>
-              <w:t>200 cm2</w:t>
+              <w:t>{uygulamaalani}</w:t>
             </w:r>
           </w:p>
         </w:tc>
@@ -4319,7 +4374,7 @@
               <w:rPr>
                 <w:rStyle w:val="CharacterStyle11"/>
               </w:rPr>
-              <w:t>20,630</w:t>
+              <w:t>{uygulamamiktari}</w:t>
             </w:r>
           </w:p>
         </w:tc>
@@ -4380,7 +4435,7 @@
               <w:rPr>
                 <w:rStyle w:val="CharacterStyle11"/>
               </w:rPr>
-              <w:t>1/gün</w:t>
+              <w:t>{temassüre}</w:t>
             </w:r>
           </w:p>
         </w:tc>
@@ -4502,7 +4557,7 @@
               <w:rPr>
                 <w:rStyle w:val="CharacterStyle11"/>
               </w:rPr>
-              <w:t>Yetişkinler</w:t>
+              <w:t>{hedefkisi}</w:t>
             </w:r>
           </w:p>
         </w:tc>
@@ -4563,7 +4618,7 @@
               <w:rPr>
                 <w:rStyle w:val="CharacterStyle11"/>
               </w:rPr>
-              <w:t>20,630</w:t>
+              <w:t>{Adegeri}</w:t>
             </w:r>
           </w:p>
         </w:tc>
@@ -5056,7 +5111,7 @@
               <w:rPr>
                 <w:rStyle w:val="CharacterStyle11"/>
               </w:rPr>
-              <w:t>20,630</w:t>
+              <w:t>{Adegeri}</w:t>
             </w:r>
           </w:p>
         </w:tc>
@@ -5275,6 +5330,7 @@
         <w:rPr>
           <w:rStyle w:val="CharacterStyle12"/>
         </w:rPr>
+        <w:lastRenderedPageBreak/>
         <w:t>Bütün belirgin emilim yolları dikkate alınarak ve deneyler sonucu gözlemlenen toksikolojik veriler ışığında belirlenen NO(A)EL değerine dayanarak, sistemik etkiler ve güvenlilik sınırı (MoS) hesaplanır. Bu değerlendirme yapılamıyor ise nedeni uygun bir şekilde gerekçelendirilmelidir.</w:t>
       </w:r>
     </w:p>
@@ -5296,7 +5352,6 @@
         <w:rPr>
           <w:rStyle w:val="CharacterStyle0"/>
         </w:rPr>
-        <w:lastRenderedPageBreak/>
         <w:t>MoS = NO(A)EL / SED ≥ 100</w:t>
       </w:r>
     </w:p>
@@ -5787,41 +5842,12 @@
           <w:rStyle w:val="CharacterStyle12"/>
         </w:rPr>
       </w:pPr>
-    </w:p>
-    <w:p>
-      <w:pPr>
-        <w:rPr>
-          <w:rStyle w:val="CharacterStyle12"/>
-        </w:rPr>
-      </w:pPr>
-    </w:p>
-    <w:p>
-      <w:pPr>
-        <w:rPr>
-          <w:rStyle w:val="CharacterStyle12"/>
-        </w:rPr>
-      </w:pPr>
-      <w:r>
-        <w:rPr>
-          <w:rStyle w:val="CharacterStyle12"/>
-          <w:highlight w:val="yellow"/>
-        </w:rPr>
-        <w:t>Page Break</w:t>
-      </w:r>
-    </w:p>
-    <w:p>
-      <w:pPr>
-        <w:rPr>
-          <w:rStyle w:val="CharacterStyle12"/>
-        </w:rPr>
-      </w:pPr>
-    </w:p>
-    <w:p>
-      <w:pPr>
-        <w:rPr>
-          <w:rStyle w:val="CharacterStyle12"/>
-        </w:rPr>
-      </w:pPr>
+      <w:r>
+        <w:rPr>
+          <w:rStyle w:val="CharacterStyle12"/>
+        </w:rPr>
+        <w:t>{PageBreak}</w:t>
+      </w:r>
     </w:p>
     <w:p>
       <w:pPr>
@@ -6718,7 +6744,7 @@
     <w:p>
       <w:pPr>
         <w:rPr>
-          <w:rStyle w:val="CharacterStyle16"/>
+          <w:rStyle w:val="CharacterStyle17"/>
           <w:highlight w:val="yellow"/>
         </w:rPr>
       </w:pPr>
@@ -6809,56 +6835,25 @@
           <w:rStyle w:val="CharacterStyle16"/>
         </w:rPr>
         <w:br/>
-        <w:t xml:space="preserve">belirlenmiştir; buna göre %50'lik bir emilim seviyesi varsayılmalıdır. Sadece moleküler ağırlığın &gt; 500 Da, Log </w:t>
+        <w:t xml:space="preserve">belirlenmiştir; buna göre %50'lik bir emilim seviyesi varsayılmalıdır. Sadece moleküler ağırlığın &gt; 500 Da, </w:t>
       </w:r>
       <w:r>
         <w:rPr>
           <w:rStyle w:val="CharacterStyle16"/>
-          <w:highlight w:val="yellow"/>
-        </w:rPr>
-        <w:t>Pow ≤</w:t>
-      </w:r>
-      <w:r>
-        <w:rPr>
-          <w:rStyle w:val="CharacterStyle16"/>
-          <w:highlight w:val="yellow"/>
-        </w:rPr>
-        <w:t xml:space="preserve"> </w:t>
-      </w:r>
-    </w:p>
-    <w:p>
-      <w:pPr>
-        <w:rPr>
-          <w:rStyle w:val="CharacterStyle16"/>
-          <w:highlight w:val="yellow"/>
-        </w:rPr>
-      </w:pPr>
-    </w:p>
-    <w:p>
-      <w:pPr>
+        </w:rPr>
+        <w:t xml:space="preserve">Log Pow ≤ </w:t>
+      </w:r>
+      <w:r>
         <w:rPr>
           <w:rStyle w:val="CharacterStyle17"/>
         </w:rPr>
-      </w:pPr>
+        <w:t>-</w:t>
+      </w:r>
       <w:r>
         <w:rPr>
           <w:rStyle w:val="CharacterStyle17"/>
-          <w:highlight w:val="yellow"/>
-        </w:rPr>
-        <w:t>belirlenmiştir</w:t>
-      </w:r>
-      <w:r>
-        <w:rPr>
-          <w:rStyle w:val="CharacterStyle17"/>
-        </w:rPr>
-        <w:t>; buna göre %50'lik bir emilim seviyesi varsayılmalıdır. Sadece moleküler ağırlığın &gt; 500 Da, Log Pow ≤</w:t>
-      </w:r>
-      <w:r>
-        <w:rPr>
-          <w:rStyle w:val="CharacterStyle17"/>
-        </w:rPr>
-        <w:br/>
-        <w:t>- 1 veya ≥4 ve erime noktasının &gt; 200°C olduğu durumlarda %10'luk bir dermal emilim seviyesi varsayılmıştır.</w:t>
+        </w:rPr>
+        <w:t xml:space="preserve"> 1 veya ≥4 ve erime noktasının &gt; 200°C olduğu durumlarda %10'luk bir dermal emilim seviyesi varsayılmıştır.</w:t>
       </w:r>
     </w:p>
     <w:p>
@@ -7083,106 +7078,78 @@
         <w:rPr>
           <w:rStyle w:val="CharacterStyle13"/>
         </w:rPr>
+        <w:t xml:space="preserve"> Güvenlilik Değerlendiricisinin Adı ve Adresi</w:t>
+      </w:r>
+    </w:p>
+    <w:p/>
+    <w:p>
+      <w:pPr>
+        <w:rPr>
+          <w:rStyle w:val="CharacterStyle12"/>
+        </w:rPr>
+      </w:pPr>
+      <w:r>
+        <w:rPr>
+          <w:rStyle w:val="CharacterStyle12"/>
+        </w:rPr>
+        <w:t xml:space="preserve">{AdSoyad} </w:t>
+      </w:r>
+      <w:r>
+        <w:rPr>
+          <w:rStyle w:val="CharacterStyle12"/>
+        </w:rPr>
+        <w:br/>
+      </w:r>
+      <w:r>
+        <w:rPr>
+          <w:rStyle w:val="CharacterStyle12"/>
+        </w:rPr>
+        <w:t>{Adres}</w:t>
+      </w:r>
+      <w:r>
+        <w:rPr>
+          <w:rStyle w:val="CharacterStyle12"/>
+        </w:rPr>
+        <w:br/>
+      </w:r>
+    </w:p>
+    <w:p>
+      <w:pPr>
+        <w:rPr>
+          <w:rStyle w:val="CharacterStyle13"/>
+        </w:rPr>
+      </w:pPr>
+      <w:r>
+        <w:rPr>
+          <w:rStyle w:val="CharacterStyle13"/>
+        </w:rPr>
+        <w:t>B. Güvenlilik Değerlendiricisinin Yeterlilik Kanıtı</w:t>
+      </w:r>
+    </w:p>
+    <w:p>
+      <w:pPr>
+        <w:rPr>
+          <w:rStyle w:val="CharacterStyle13"/>
+        </w:rPr>
+      </w:pPr>
+    </w:p>
+    <w:p>
+      <w:pPr>
+        <w:rPr>
+          <w:rStyle w:val="CharacterStyle12"/>
+        </w:rPr>
+      </w:pPr>
+      <w:r>
+        <w:rPr>
+          <w:rStyle w:val="CharacterStyle12"/>
+        </w:rPr>
+        <w:t>{yeterlilikkanit}</w:t>
+      </w:r>
+      <w:r>
+        <w:rPr>
+          <w:rStyle w:val="CharacterStyle12"/>
+        </w:rPr>
         <w:t xml:space="preserve"> </w:t>
-      </w:r>
-      <w:r>
-        <w:rPr>
-          <w:rStyle w:val="CharacterStyle13"/>
-        </w:rPr>
-        <w:t>Güvenlilik Değerlendiricisinin Adı ve Adresi</w:t>
-      </w:r>
-    </w:p>
-    <w:p/>
-    <w:p>
-      <w:pPr>
-        <w:rPr>
-          <w:rStyle w:val="CharacterStyle12"/>
-        </w:rPr>
-      </w:pPr>
-      <w:r>
-        <w:rPr>
-          <w:rStyle w:val="CharacterStyle12"/>
-        </w:rPr>
-        <w:t>Oğuzhan EKER</w:t>
-      </w:r>
-      <w:r>
-        <w:rPr>
-          <w:rStyle w:val="CharacterStyle12"/>
-        </w:rPr>
-        <w:br/>
-        <w:t>ROOT KOZMETİK A.Ş.</w:t>
-      </w:r>
-      <w:r>
-        <w:rPr>
-          <w:rStyle w:val="CharacterStyle12"/>
-        </w:rPr>
-        <w:br/>
-      </w:r>
-      <w:r>
-        <w:rPr>
-          <w:rStyle w:val="CharacterStyle12"/>
-        </w:rPr>
-        <w:lastRenderedPageBreak/>
-        <w:t>Yakuplu Mah. Hürriyet Blv. Yakuplu Eval Plaza No.131 D.40 Beylikdüzü İstanbul</w:t>
-      </w:r>
-      <w:r>
-        <w:rPr>
-          <w:rStyle w:val="CharacterStyle12"/>
-        </w:rPr>
-        <w:br/>
-        <w:t xml:space="preserve">+90 (212) 909 82 08 / </w:t>
-      </w:r>
-      <w:hyperlink r:id="rId7" w:history="1">
-        <w:r>
-          <w:rPr>
-            <w:rStyle w:val="Kpr"/>
-            <w:rFonts w:ascii="Microsoft Sans Serif" w:eastAsia="Microsoft Sans Serif" w:hAnsi="Microsoft Sans Serif"/>
-            <w:noProof/>
-            <w:sz w:val="19"/>
-            <w:szCs w:val="19"/>
-          </w:rPr>
-          <w:t>info@rootarge.com</w:t>
-        </w:r>
-      </w:hyperlink>
-    </w:p>
-    <w:p>
-      <w:pPr>
-        <w:rPr>
-          <w:rStyle w:val="CharacterStyle12"/>
-        </w:rPr>
-      </w:pPr>
-    </w:p>
-    <w:p>
-      <w:pPr>
-        <w:rPr>
-          <w:rStyle w:val="CharacterStyle13"/>
-        </w:rPr>
-      </w:pPr>
-      <w:r>
-        <w:rPr>
-          <w:rStyle w:val="CharacterStyle13"/>
-        </w:rPr>
-        <w:t>B. Güvenlilik Değerlendiricisinin Yeterlilik Kanıtı</w:t>
-      </w:r>
-    </w:p>
-    <w:p>
-      <w:pPr>
-        <w:rPr>
-          <w:rStyle w:val="CharacterStyle13"/>
-        </w:rPr>
-      </w:pPr>
-    </w:p>
-    <w:p>
-      <w:pPr>
-        <w:rPr>
-          <w:rStyle w:val="CharacterStyle12"/>
-        </w:rPr>
-      </w:pPr>
-      <w:r>
-        <w:rPr>
-          <w:rStyle w:val="CharacterStyle12"/>
-        </w:rPr>
-        <w:t xml:space="preserve">Balıkesir Üniversitesi Fen Fakültesi // Kimya </w:t>
       </w:r>
       <w:r>
         <w:rPr>
@@ -7273,7 +7240,7 @@
               <w:rPr>
                 <w:rStyle w:val="CharacterStyle11"/>
               </w:rPr>
-              <w:t>18.12.2024</w:t>
+              <w:t>{today}</w:t>
             </w:r>
           </w:p>
         </w:tc>
@@ -7345,7 +7312,7 @@
                           <pic:cNvPicPr/>
                         </pic:nvPicPr>
                         <pic:blipFill>
-                          <a:blip r:embed="rId8"/>
+                          <a:blip r:embed="rId7"/>
                           <a:stretch>
                             <a:fillRect/>
                           </a:stretch>
@@ -7384,8 +7351,8 @@
     </w:tbl>
     <w:p/>
     <w:sectPr>
-      <w:headerReference w:type="default" r:id="rId9"/>
-      <w:footerReference w:type="default" r:id="rId10"/>
+      <w:headerReference w:type="default" r:id="rId8"/>
+      <w:footerReference w:type="default" r:id="rId9"/>
       <w:pgSz w:w="11906" w:h="16838"/>
       <w:pgMar w:top="1417" w:right="1417" w:bottom="1417" w:left="1417" w:header="426" w:footer="196" w:gutter="0"/>
       <w:cols w:space="708"/>
@@ -8603,7 +8570,6 @@
   <w:style w:type="character" w:default="1" w:styleId="VarsaylanParagrafYazTipi">
     <w:name w:val="Default Paragraph Font"/>
     <w:uiPriority w:val="1"/>
-    <w:semiHidden/>
     <w:unhideWhenUsed/>
   </w:style>
   <w:style w:type="table" w:default="1" w:styleId="NormalTablo">
@@ -9660,6 +9626,19 @@
       <w:shd w:val="clear" w:color="auto" w:fill="E1DFDD"/>
     </w:rPr>
   </w:style>
+  <w:style w:type="paragraph" w:styleId="NormalWeb">
+    <w:name w:val="Normal (Web)"/>
+    <w:basedOn w:val="Normal"/>
+    <w:uiPriority w:val="99"/>
+    <w:semiHidden/>
+    <w:unhideWhenUsed/>
+    <w:rsid w:val="001B1CC5"/>
+    <w:rPr>
+      <w:rFonts w:ascii="Times New Roman" w:hAnsi="Times New Roman"/>
+      <w:sz w:val="24"/>
+      <w:szCs w:val="24"/>
+    </w:rPr>
+  </w:style>
 </w:styles>
 </file>
 

</xml_diff>